<commit_message>
feat(kb): expand multi-format sample corpus
</commit_message>
<xml_diff>
--- a/data/documents/差旅与报销制度.docx
+++ b/data/documents/差旅与报销制度.docx
@@ -3,86 +3,427 @@
 <w:document xmlns:wpc="http://schemas.microsoft.com/office/word/2010/wordprocessingCanvas" xmlns:mo="http://schemas.microsoft.com/office/mac/office/2008/main" xmlns:mc="http://schemas.openxmlformats.org/markup-compatibility/2006" xmlns:mv="urn:schemas-microsoft-com:mac:vml" xmlns:o="urn:schemas-microsoft-com:office:office" xmlns:r="http://schemas.openxmlformats.org/officeDocument/2006/relationships" xmlns:m="http://schemas.openxmlformats.org/officeDocument/2006/math" xmlns:v="urn:schemas-microsoft-com:vml" xmlns:wp14="http://schemas.microsoft.com/office/word/2010/wordprocessingDrawing" xmlns:wp="http://schemas.openxmlformats.org/drawingml/2006/wordprocessingDrawing" xmlns:w10="urn:schemas-microsoft-com:office:word" xmlns:w="http://schemas.openxmlformats.org/wordprocessingml/2006/main" xmlns:w14="http://schemas.microsoft.com/office/word/2010/wordml" xmlns:wpg="http://schemas.microsoft.com/office/word/2010/wordprocessingGroup" xmlns:wpi="http://schemas.microsoft.com/office/word/2010/wordprocessingInk" xmlns:wne="http://schemas.microsoft.com/office/word/2006/wordml" xmlns:wps="http://schemas.microsoft.com/office/word/2010/wordprocessingShape" mc:Ignorable="w14 wp14">
   <w:body>
     <w:p>
+      <w:r>
+        <w:drawing>
+          <wp:inline xmlns:a="http://schemas.openxmlformats.org/drawingml/2006/main" xmlns:pic="http://schemas.openxmlformats.org/drawingml/2006/picture">
+            <wp:extent cx="6126480" cy="2116420"/>
+            <wp:docPr id="1" name="Picture 1"/>
+            <wp:cNvGraphicFramePr>
+              <a:graphicFrameLocks noChangeAspect="1"/>
+            </wp:cNvGraphicFramePr>
+            <a:graphic>
+              <a:graphicData uri="http://schemas.openxmlformats.org/drawingml/2006/picture">
+                <pic:pic>
+                  <pic:nvPicPr>
+                    <pic:cNvPr id="0" name="image.jpg"/>
+                    <pic:cNvPicPr/>
+                  </pic:nvPicPr>
+                  <pic:blipFill>
+                    <a:blip r:embed="rId10"/>
+                    <a:stretch>
+                      <a:fillRect/>
+                    </a:stretch>
+                  </pic:blipFill>
+                  <pic:spPr>
+                    <a:xfrm>
+                      <a:off x="0" y="0"/>
+                      <a:ext cx="6126480" cy="2116420"/>
+                    </a:xfrm>
+                    <a:prstGeom prst="rect"/>
+                  </pic:spPr>
+                </pic:pic>
+              </a:graphicData>
+            </a:graphic>
+          </wp:inline>
+        </w:drawing>
+      </w:r>
+    </w:p>
+    <w:p>
       <w:pPr>
-        <w:pStyle w:val="Heading1"/>
+        <w:spacing w:before="240" w:after="40"/>
+        <w:jc w:val="center"/>
       </w:pPr>
       <w:r>
+        <w:rPr>
+          <w:rFonts w:ascii="Microsoft YaHei" w:hAnsi="Microsoft YaHei" w:eastAsia="Microsoft YaHei"/>
+          <w:b/>
+          <w:color w:val="19274B"/>
+          <w:sz w:val="48"/>
+        </w:rPr>
         <w:t>差旅与报销制度</w:t>
       </w:r>
     </w:p>
     <w:p>
       <w:pPr>
-        <w:pStyle w:val="Heading2"/>
+        <w:jc w:val="center"/>
+      </w:pPr>
+      <w:r>
+        <w:rPr>
+          <w:rFonts w:ascii="Microsoft YaHei" w:hAnsi="Microsoft YaHei" w:eastAsia="Microsoft YaHei"/>
+          <w:color w:val="697691"/>
+          <w:sz w:val="22"/>
+        </w:rPr>
+        <w:t>审批、标准、单据和付款的一站式参考</w:t>
+      </w:r>
+    </w:p>
+    <w:tbl>
+      <w:tblPr>
+        <w:tblW w:type="auto" w:w="0"/>
+        <w:tblLayout w:type="autofit"/>
+        <w:tblLook w:firstColumn="1" w:firstRow="1" w:lastColumn="0" w:lastRow="0" w:noHBand="0" w:noVBand="1" w:val="04A0"/>
+      </w:tblPr>
+      <w:tblGrid>
+        <w:gridCol w:w="3216"/>
+        <w:gridCol w:w="3216"/>
+        <w:gridCol w:w="3216"/>
+      </w:tblGrid>
+      <w:tr>
+        <w:tc>
+          <w:tcPr>
+            <w:tcW w:type="dxa" w:w="3216"/>
+            <w:shd w:fill="EEF1FF"/>
+          </w:tcPr>
+          <w:p>
+            <w:pPr>
+              <w:jc w:val="center"/>
+            </w:pPr>
+            <w:r>
+              <w:rPr>
+                <w:rFonts w:ascii="Microsoft YaHei" w:hAnsi="Microsoft YaHei" w:eastAsia="Microsoft YaHei"/>
+                <w:b/>
+                <w:color w:val="19274B"/>
+                <w:sz w:val="18"/>
+              </w:rPr>
+              <w:t>适用范围</w:t>
+              <w:br/>
+              <w:t>全体员工</w:t>
+            </w:r>
+          </w:p>
+        </w:tc>
+        <w:tc>
+          <w:tcPr>
+            <w:tcW w:type="dxa" w:w="3216"/>
+            <w:shd w:fill="EEF1FF"/>
+          </w:tcPr>
+          <w:p>
+            <w:pPr>
+              <w:jc w:val="center"/>
+            </w:pPr>
+            <w:r>
+              <w:rPr>
+                <w:rFonts w:ascii="Microsoft YaHei" w:hAnsi="Microsoft YaHei" w:eastAsia="Microsoft YaHei"/>
+                <w:b/>
+                <w:color w:val="19274B"/>
+                <w:sz w:val="18"/>
+              </w:rPr>
+              <w:t>提交时限</w:t>
+              <w:br/>
+              <w:t>返程后 10 个工作日</w:t>
+            </w:r>
+          </w:p>
+        </w:tc>
+        <w:tc>
+          <w:tcPr>
+            <w:tcW w:type="dxa" w:w="3216"/>
+            <w:shd w:fill="EEF1FF"/>
+          </w:tcPr>
+          <w:p>
+            <w:pPr>
+              <w:jc w:val="center"/>
+            </w:pPr>
+            <w:r>
+              <w:rPr>
+                <w:rFonts w:ascii="Microsoft YaHei" w:hAnsi="Microsoft YaHei" w:eastAsia="Microsoft YaHei"/>
+                <w:b/>
+                <w:color w:val="19274B"/>
+                <w:sz w:val="18"/>
+              </w:rPr>
+              <w:t>咨询渠道</w:t>
+              <w:br/>
+              <w:t>财务共享中心</w:t>
+            </w:r>
+          </w:p>
+        </w:tc>
+      </w:tr>
+    </w:tbl>
+    <w:p>
+      <w:pPr>
+        <w:pStyle w:val="Heading1"/>
+      </w:pPr>
+      <w:r>
+        <w:t>适用范围与原则</w:t>
+      </w:r>
+    </w:p>
+    <w:p>
+      <w:pPr>
+        <w:pStyle w:val="ListBullet"/>
+        <w:spacing w:after="80"/>
+      </w:pPr>
+      <w:r>
+        <w:rPr>
+          <w:rFonts w:ascii="Microsoft YaHei" w:hAnsi="Microsoft YaHei" w:eastAsia="Microsoft YaHei"/>
+        </w:rPr>
+        <w:t>本制度适用于因公发生的国内出差、交通、住宿、餐饮和必要业务招待费用。</w:t>
+      </w:r>
+    </w:p>
+    <w:p>
+      <w:pPr>
+        <w:pStyle w:val="ListBullet"/>
+        <w:spacing w:after="80"/>
+      </w:pPr>
+      <w:r>
+        <w:rPr>
+          <w:rFonts w:ascii="Microsoft YaHei" w:hAnsi="Microsoft YaHei" w:eastAsia="Microsoft YaHei"/>
+        </w:rPr>
+        <w:t>员工应坚持真实、必要、节约原则，不得拆分费用、重复报销或使用与业务无关的票据。</w:t>
+      </w:r>
+    </w:p>
+    <w:p>
+      <w:pPr>
+        <w:pStyle w:val="Heading1"/>
       </w:pPr>
       <w:r>
         <w:t>出差申请</w:t>
       </w:r>
     </w:p>
     <w:p>
+      <w:pPr>
+        <w:pStyle w:val="ListBullet"/>
+        <w:spacing w:after="80"/>
+      </w:pPr>
       <w:r>
-        <w:t>出差人员应至少提前 3 个工作日提交申请，写明目的地、事由、日期和预算。未经审批产生的费用原则上不予报销。</w:t>
+        <w:rPr>
+          <w:rFonts w:ascii="Microsoft YaHei" w:hAnsi="Microsoft YaHei" w:eastAsia="Microsoft YaHei"/>
+        </w:rPr>
+        <w:t>至少提前 3 个工作日提交申请，写明目的地、事由、日期、预算和同行人。</w:t>
       </w:r>
     </w:p>
     <w:p>
       <w:pPr>
-        <w:pStyle w:val="Heading2"/>
+        <w:pStyle w:val="ListBullet"/>
+        <w:spacing w:after="80"/>
       </w:pPr>
       <w:r>
-        <w:t>交通标准</w:t>
-      </w:r>
-    </w:p>
-    <w:p>
-      <w:r>
-        <w:t>国内出差优先选择高铁二等座或经济舱。确因时间紧急升级交通标准时，必须附部门负责人书面说明。</w:t>
+        <w:rPr>
+          <w:rFonts w:ascii="Microsoft YaHei" w:hAnsi="Microsoft YaHei" w:eastAsia="Microsoft YaHei"/>
+        </w:rPr>
+        <w:t>未经审批产生的费用原则上不予报销；紧急出差应在返程后 2 个工作日内补充说明。</w:t>
       </w:r>
     </w:p>
     <w:p>
       <w:pPr>
-        <w:pStyle w:val="Heading2"/>
+        <w:pStyle w:val="Heading1"/>
       </w:pPr>
       <w:r>
-        <w:t>住宿标准</w:t>
-      </w:r>
-    </w:p>
-    <w:p>
-      <w:r>
-        <w:t>一线城市住宿上限为每晚 600 元，其他城市为每晚 450 元。两人同行且条件允许时优先安排双人间。</w:t>
+        <w:t>交通与住宿标准</w:t>
       </w:r>
     </w:p>
     <w:p>
       <w:pPr>
-        <w:pStyle w:val="Heading2"/>
+        <w:pStyle w:val="ListBullet"/>
+        <w:spacing w:after="80"/>
+      </w:pPr>
+      <w:r>
+        <w:rPr>
+          <w:rFonts w:ascii="Microsoft YaHei" w:hAnsi="Microsoft YaHei" w:eastAsia="Microsoft YaHei"/>
+        </w:rPr>
+        <w:t>国内交通优先高铁二等座或经济舱；市内交通选择公共交通或合规网约车。</w:t>
+      </w:r>
+    </w:p>
+    <w:p>
+      <w:pPr>
+        <w:pStyle w:val="ListBullet"/>
+        <w:spacing w:after="80"/>
+      </w:pPr>
+      <w:r>
+        <w:rPr>
+          <w:rFonts w:ascii="Microsoft YaHei" w:hAnsi="Microsoft YaHei" w:eastAsia="Microsoft YaHei"/>
+        </w:rPr>
+        <w:t>一线城市住宿上限为 600 元/晚，其他城市 450 元/晚；会议统一住宿按会议标准执行。</w:t>
+      </w:r>
+    </w:p>
+    <w:p>
+      <w:pPr>
+        <w:pStyle w:val="ListBullet"/>
+        <w:spacing w:after="80"/>
+      </w:pPr>
+      <w:r>
+        <w:rPr>
+          <w:rFonts w:ascii="Microsoft YaHei" w:hAnsi="Microsoft YaHei" w:eastAsia="Microsoft YaHei"/>
+        </w:rPr>
+        <w:t>确需升级标准时，必须在预订前取得部门负责人书面批准。</w:t>
+      </w:r>
+    </w:p>
+    <w:p>
+      <w:pPr>
+        <w:pStyle w:val="Heading1"/>
+      </w:pPr>
+      <w:r>
+        <w:t>补贴与业务招待</w:t>
+      </w:r>
+    </w:p>
+    <w:p>
+      <w:pPr>
+        <w:pStyle w:val="ListBullet"/>
+        <w:spacing w:after="80"/>
+      </w:pPr>
+      <w:r>
+        <w:rPr>
+          <w:rFonts w:ascii="Microsoft YaHei" w:hAnsi="Microsoft YaHei" w:eastAsia="Microsoft YaHei"/>
+        </w:rPr>
+        <w:t>差旅餐饮补贴为每人每天 100 元，客户或会议承担餐饮的日期不重复领取。</w:t>
+      </w:r>
+    </w:p>
+    <w:p>
+      <w:pPr>
+        <w:pStyle w:val="ListBullet"/>
+        <w:spacing w:after="80"/>
+      </w:pPr>
+      <w:r>
+        <w:rPr>
+          <w:rFonts w:ascii="Microsoft YaHei" w:hAnsi="Microsoft YaHei" w:eastAsia="Microsoft YaHei"/>
+        </w:rPr>
+        <w:t>业务招待应事前审批，报销时填写参与人、单位、业务事由和人均金额。</w:t>
+      </w:r>
+    </w:p>
+    <w:p>
+      <w:pPr>
+        <w:pStyle w:val="Heading1"/>
       </w:pPr>
       <w:r>
         <w:t>报销材料</w:t>
       </w:r>
     </w:p>
     <w:p>
+      <w:pPr>
+        <w:pStyle w:val="ListBullet"/>
+        <w:spacing w:after="80"/>
+      </w:pPr>
       <w:r>
-        <w:t>报销需要差旅审批单、交通和住宿发票、行程单、支付凭证。出差结束后 10 个工作日内提交，超标费用须附说明。</w:t>
+        <w:rPr>
+          <w:rFonts w:ascii="Microsoft YaHei" w:hAnsi="Microsoft YaHei" w:eastAsia="Microsoft YaHei"/>
+        </w:rPr>
+        <w:t>提交差旅审批单、合法发票、消费明细、支付凭证和必要的行程证明。</w:t>
       </w:r>
     </w:p>
     <w:p>
       <w:pPr>
-        <w:pStyle w:val="Heading2"/>
+        <w:pStyle w:val="ListBullet"/>
+        <w:spacing w:after="80"/>
       </w:pPr>
       <w:r>
-        <w:t>差旅补贴</w:t>
+        <w:rPr>
+          <w:rFonts w:ascii="Microsoft YaHei" w:hAnsi="Microsoft YaHei" w:eastAsia="Microsoft YaHei"/>
+        </w:rPr>
+        <w:t>电子发票必须上传原始 PDF；抬头和税号错误的发票应先更正。</w:t>
       </w:r>
     </w:p>
     <w:p>
+      <w:pPr>
+        <w:pStyle w:val="Heading1"/>
+      </w:pPr>
       <w:r>
-        <w:t>出差期间按自然日发放餐饮补贴，每人每天 100 元。由客户承担餐饮的日期不重复领取补贴。</w:t>
+        <w:t>时间与付款</w:t>
+      </w:r>
+    </w:p>
+    <w:p>
+      <w:pPr>
+        <w:pStyle w:val="ListBullet"/>
+        <w:spacing w:after="80"/>
+      </w:pPr>
+      <w:r>
+        <w:rPr>
+          <w:rFonts w:ascii="Microsoft YaHei" w:hAnsi="Microsoft YaHei" w:eastAsia="Microsoft YaHei"/>
+        </w:rPr>
+        <w:t>返程后 10 个工作日内提交报销，逾期需附原因并由部门负责人确认。</w:t>
+      </w:r>
+    </w:p>
+    <w:p>
+      <w:pPr>
+        <w:pStyle w:val="ListBullet"/>
+        <w:spacing w:after="80"/>
+      </w:pPr>
+      <w:r>
+        <w:rPr>
+          <w:rFonts w:ascii="Microsoft YaHei" w:hAnsi="Microsoft YaHei" w:eastAsia="Microsoft YaHei"/>
+        </w:rPr>
+        <w:t>审批完成且材料齐全后，财务通常在 5 个工作日内付款。</w:t>
+      </w:r>
+    </w:p>
+    <w:p>
+      <w:pPr>
+        <w:pStyle w:val="Heading1"/>
+      </w:pPr>
+      <w:r>
+        <w:t>禁止事项与咨询</w:t>
+      </w:r>
+    </w:p>
+    <w:p>
+      <w:pPr>
+        <w:pStyle w:val="ListBullet"/>
+        <w:spacing w:after="80"/>
+      </w:pPr>
+      <w:r>
+        <w:rPr>
+          <w:rFonts w:ascii="Microsoft YaHei" w:hAnsi="Microsoft YaHei" w:eastAsia="Microsoft YaHei"/>
+        </w:rPr>
+        <w:t>严禁虚假行程、虚开发票、重复报销、私费公报或替他人报销。</w:t>
+      </w:r>
+    </w:p>
+    <w:p>
+      <w:pPr>
+        <w:pStyle w:val="ListBullet"/>
+        <w:spacing w:after="80"/>
+      </w:pPr>
+      <w:r>
+        <w:rPr>
+          <w:rFonts w:ascii="Microsoft YaHei" w:hAnsi="Microsoft YaHei" w:eastAsia="Microsoft YaHei"/>
+        </w:rPr>
+        <w:t>对标准或单据有疑问时，应在消费前咨询财务共享中心。</w:t>
+      </w:r>
+    </w:p>
+    <w:p>
+      <w:pPr>
+        <w:spacing w:before="240"/>
+      </w:pPr>
+      <w:r>
+        <w:rPr>
+          <w:rFonts w:ascii="Microsoft YaHei" w:hAnsi="Microsoft YaHei" w:eastAsia="Microsoft YaHei"/>
+          <w:i/>
+          <w:color w:val="697691"/>
+          <w:sz w:val="18"/>
+        </w:rPr>
+        <w:t>提示：本资料用于知识库检索测试；若与最新公告冲突，以公司正式发布版本为准。</w:t>
       </w:r>
     </w:p>
     <w:sectPr>
+      <w:footerReference w:type="default" r:id="rId9"/>
       <w:pgSz w:w="12240" w:h="15840"/>
-      <w:pgMar w:top="1440" w:right="1800" w:bottom="1440" w:left="1800" w:header="720" w:footer="720" w:gutter="0"/>
+      <w:pgMar w:top="1152" w:right="1296" w:bottom="1080" w:left="1296" w:header="720" w:footer="720" w:gutter="0"/>
       <w:cols w:space="720"/>
       <w:docGrid w:linePitch="360"/>
     </w:sectPr>
   </w:body>
 </w:document>
+</file>
+
+<file path=word/footer1.xml><?xml version="1.0" encoding="utf-8"?>
+<w:ftr xmlns:m="http://schemas.openxmlformats.org/officeDocument/2006/math" xmlns:mc="http://schemas.openxmlformats.org/markup-compatibility/2006" xmlns:mo="http://schemas.microsoft.com/office/mac/office/2008/main" xmlns:mv="urn:schemas-microsoft-com:mac:vml" xmlns:o="urn:schemas-microsoft-com:office:office" xmlns:r="http://schemas.openxmlformats.org/officeDocument/2006/relationships" xmlns:v="urn:schemas-microsoft-com:vml" xmlns:w10="urn:schemas-microsoft-com:office:word" xmlns:w14="http://schemas.microsoft.com/office/word/2010/wordml" xmlns:w="http://schemas.openxmlformats.org/wordprocessingml/2006/main" xmlns:wne="http://schemas.microsoft.com/office/word/2006/wordml" xmlns:wp14="http://schemas.microsoft.com/office/word/2010/wordprocessingDrawing" xmlns:wp="http://schemas.openxmlformats.org/drawingml/2006/wordprocessingDrawing" xmlns:wpc="http://schemas.microsoft.com/office/word/2010/wordprocessingCanvas" xmlns:wpg="http://schemas.microsoft.com/office/word/2010/wordprocessingGroup" xmlns:wpi="http://schemas.microsoft.com/office/word/2010/wordprocessingInk" xmlns:wps="http://schemas.microsoft.com/office/word/2010/wordprocessingShape" mc:Ignorable="w14 wp14">
+  <w:p>
+    <w:pPr>
+      <w:pStyle w:val="Footer"/>
+      <w:jc w:val="center"/>
+    </w:pPr>
+    <w:r>
+      <w:rPr>
+        <w:rFonts w:ascii="Microsoft YaHei" w:hAnsi="Microsoft YaHei" w:eastAsia="Microsoft YaHei"/>
+        <w:color w:val="697691"/>
+        <w:sz w:val="16"/>
+      </w:rPr>
+      <w:t>小苏企业知识库 · 内部资料 · 2026</w:t>
+    </w:r>
+  </w:p>
+</w:ftr>
 </file>
 
 <file path=word/numbering.xml><?xml version="1.0" encoding="utf-8"?>
@@ -448,6 +789,13 @@
     <w:name w:val="Normal"/>
     <w:qFormat/>
     <w:rsid w:val="00FC693F"/>
+    <w:pPr>
+      <w:spacing w:after="120" w:line="293" w:lineRule="auto"/>
+    </w:pPr>
+    <w:rPr>
+      <w:rFonts w:ascii="Calibri" w:hAnsi="Calibri" w:eastAsia="Microsoft YaHei"/>
+      <w:sz w:val="21"/>
+    </w:rPr>
   </w:style>
   <w:style w:type="paragraph" w:styleId="Header">
     <w:name w:val="header"/>
@@ -504,15 +852,15 @@
     <w:pPr>
       <w:keepNext/>
       <w:keepLines/>
-      <w:spacing w:before="480" w:after="0"/>
+      <w:spacing w:before="320" w:after="140"/>
       <w:outlineLvl w:val="0"/>
     </w:pPr>
     <w:rPr>
-      <w:rFonts w:asciiTheme="majorHAnsi" w:eastAsiaTheme="majorEastAsia" w:hAnsiTheme="majorHAnsi" w:cstheme="majorBidi"/>
+      <w:rFonts w:asciiTheme="majorHAnsi" w:eastAsiaTheme="majorEastAsia" w:hAnsiTheme="majorHAnsi" w:cstheme="majorBidi" w:ascii="Calibri" w:hAnsi="Calibri" w:eastAsia="Microsoft YaHei"/>
       <w:b/>
       <w:bCs/>
-      <w:color w:val="365F91" w:themeColor="accent1" w:themeShade="BF"/>
-      <w:sz w:val="28"/>
+      <w:color w:val="4A5DE6"/>
+      <w:sz w:val="32"/>
       <w:szCs w:val="28"/>
     </w:rPr>
   </w:style>
@@ -528,14 +876,14 @@
     <w:pPr>
       <w:keepNext/>
       <w:keepLines/>
-      <w:spacing w:before="200" w:after="0"/>
+      <w:spacing w:before="240" w:after="100"/>
       <w:outlineLvl w:val="1"/>
     </w:pPr>
     <w:rPr>
-      <w:rFonts w:asciiTheme="majorHAnsi" w:eastAsiaTheme="majorEastAsia" w:hAnsiTheme="majorHAnsi" w:cstheme="majorBidi"/>
+      <w:rFonts w:asciiTheme="majorHAnsi" w:eastAsiaTheme="majorEastAsia" w:hAnsiTheme="majorHAnsi" w:cstheme="majorBidi" w:ascii="Calibri" w:hAnsi="Calibri" w:eastAsia="Microsoft YaHei"/>
       <w:b/>
       <w:bCs/>
-      <w:color w:val="4F81BD" w:themeColor="accent1"/>
+      <w:color w:val="4A5DE6"/>
       <w:sz w:val="26"/>
       <w:szCs w:val="26"/>
     </w:rPr>
@@ -552,14 +900,15 @@
     <w:pPr>
       <w:keepNext/>
       <w:keepLines/>
-      <w:spacing w:before="200" w:after="0"/>
+      <w:spacing w:before="180" w:after="80"/>
       <w:outlineLvl w:val="2"/>
     </w:pPr>
     <w:rPr>
-      <w:rFonts w:asciiTheme="majorHAnsi" w:eastAsiaTheme="majorEastAsia" w:hAnsiTheme="majorHAnsi" w:cstheme="majorBidi"/>
+      <w:rFonts w:asciiTheme="majorHAnsi" w:eastAsiaTheme="majorEastAsia" w:hAnsiTheme="majorHAnsi" w:cstheme="majorBidi" w:ascii="Calibri" w:hAnsi="Calibri" w:eastAsia="Microsoft YaHei"/>
       <w:b/>
       <w:bCs/>
-      <w:color w:val="4F81BD" w:themeColor="accent1"/>
+      <w:color w:val="19274B"/>
+      <w:sz w:val="23"/>
     </w:rPr>
   </w:style>
   <w:style w:type="paragraph" w:styleId="Heading4">

</xml_diff>